<commit_message>
Add KAS checklist, Gutachten, tabular CV; rework review for KAS Promotionsförderung
- Official KAS checklist (02/2026), Gutachten Prof. Winnewisser, tabellarischer Lebenslauf
- README rewritten: item-by-item check against KAS checklist, flags foundation
  mismatch (Studienstiftung docs vs. KAS application), lists missing items
- Studienstiftung forms updated with confirmed facts (dual citizenship, online Master)

Co-Authored-By: Claude Fable 5 <noreply@anthropic.com>
Claude-Session: https://claude.ai/code/session_01YQ4W3FQBBvVNpX7kTKXi4o
</commit_message>
<xml_diff>
--- a/HealthLedgerAI/scholarship application/Bewerber_Fragebogen_AUSGEFUELLT_Polychroniadou.docx
+++ b/HealthLedgerAI/scholarship application/Bewerber_Fragebogen_AUSGEFUELLT_Polychroniadou.docx
@@ -501,7 +501,7 @@
         <w:t xml:space="preserve">Name der Hochschule: </w:t>
       </w:r>
       <w:r>
-        <w:t>European University Cyprus, Nikosia</w:t>
+        <w:t>European University Cyprus, Nikosia (Online-Studium)</w:t>
       </w:r>
     </w:p>
     <w:p>
@@ -822,46 +822,6 @@
       </w:r>
       <w:r>
         <w:t>24.06.2026 – 21.08.2026</w:t>
-      </w:r>
-    </w:p>
-    <w:p>
-      <w:r>
-        <w:rPr>
-          <w:i w:val="0"/>
-        </w:rPr>
-      </w:r>
-    </w:p>
-    <w:p>
-      <w:r>
-        <w:rPr>
-          <w:b/>
-        </w:rPr>
-        <w:t xml:space="preserve">Mit welchem Ziel: </w:t>
-      </w:r>
-      <w:r>
-        <w:t>Masterstudium (Data Analytics in Accounting and Finance)</w:t>
-      </w:r>
-    </w:p>
-    <w:p>
-      <w:r>
-        <w:rPr>
-          <w:b/>
-        </w:rPr>
-        <w:t xml:space="preserve">Staat/Stadt: </w:t>
-      </w:r>
-      <w:r>
-        <w:t>Zypern / Nikosia</w:t>
-      </w:r>
-    </w:p>
-    <w:p>
-      <w:r>
-        <w:rPr>
-          <w:b/>
-        </w:rPr>
-        <w:t xml:space="preserve">Zeitraum: </w:t>
-      </w:r>
-      <w:r>
-        <w:t>seit 10/2025 [BITTE PRÜFEN, falls das Studium überwiegend digital/aus Deutschland absolviert wird, diesen Eintrag anpassen]</w:t>
       </w:r>
     </w:p>
     <w:p>

</xml_diff>

<commit_message>
Update Studienstiftung forms with confirmed data; add Kythreotis Betreuer-Fragebogen
Co-Authored-By: Claude Fable 5 <noreply@anthropic.com>
Claude-Session: https://claude.ai/code/session_01YQ4W3FQBBvVNpX7kTKXi4o
</commit_message>
<xml_diff>
--- a/HealthLedgerAI/scholarship application/Bewerber_Fragebogen_AUSGEFUELLT_Polychroniadou.docx
+++ b/HealthLedgerAI/scholarship application/Bewerber_Fragebogen_AUSGEFUELLT_Polychroniadou.docx
@@ -188,7 +188,7 @@
         <w:t xml:space="preserve">Arbeit an der Diss. seit: </w:t>
       </w:r>
       <w:r>
-        <w:t>Monat: [BITTE PRÜFEN, z. B. 09]   Jahr: 2025 (Vorbereitungsphase: Erstellung Exposé, Entwicklung des Forschungsprototyps HealthLedger AI)</w:t>
+        <w:t>Monat: 01   Jahr: 2026 (Vorbereitungsphase: Erstellung des Exposés bis 03/2026, Entwicklung des Prototyps HealthLedger AI, systematische Literaturrecherche seit 04/2026)</w:t>
       </w:r>
     </w:p>
     <w:p>
@@ -229,7 +229,7 @@
         <w:rPr>
           <w:i w:val="0"/>
         </w:rPr>
-        <w:t>Zeitraum: von Beginn der Vorbereitungsphase (2025) bis laufend</w:t>
+        <w:t>Zeitraum: von Beginn der Vorbereitungsphase (Anfang 2026) bis laufend</w:t>
       </w:r>
     </w:p>
     <w:p>
@@ -240,7 +240,7 @@
         <w:t xml:space="preserve">Bei anderen Institutionen laufende oder geplante Anträge auf Förderung der Dissertation: </w:t>
       </w:r>
       <w:r>
-        <w:t>Keine. [BITTE PRÜFEN – falls z. B. parallele Anträge geplant sind, hier angeben]</w:t>
+        <w:t>Konrad-Adenauer-Stiftung (Promotionsstipendium): Antrag im Bewerbungsverfahren (Online-Bewerbung eingereicht 07/2026, Entscheidung ausstehend)</w:t>
       </w:r>
     </w:p>
     <w:p>
@@ -326,7 +326,7 @@
         <w:t xml:space="preserve">Art und Zeitpunkt der Hochschulzugangsberechtigung: </w:t>
       </w:r>
       <w:r>
-        <w:t>Allgemeine Hochschulreife (Abitur), 2015, St. Josef-Schule Mädchengymnasium, Jülich</w:t>
+        <w:t>Allgemeine Hochschulreife (Abitur), 19.06.2015, St. Josef-Schule Mädchengymnasium, Jülich (Durchschnittsnote 3,1)</w:t>
       </w:r>
     </w:p>
     <w:p>
@@ -439,7 +439,7 @@
         <w:t xml:space="preserve">Zeitraum (Monat/Jahr): </w:t>
       </w:r>
       <w:r>
-        <w:t>von [MM]/2019 bis [MM]/2024 [BITTE ERGÄNZEN]</w:t>
+        <w:t>von 09/2019 bis 10/2024 (Bachelorexamen: 29.10.2024)</w:t>
       </w:r>
     </w:p>
     <w:p>
@@ -472,7 +472,7 @@
         <w:t xml:space="preserve">Abschlussnote und Prädikat: </w:t>
       </w:r>
       <w:r>
-        <w:t>[BITTE ERGÄNZEN – Gesamtnote]; Bachelorarbeit: 1,0; Kolloquium: 1,0</w:t>
+        <w:t>2,5 (gut); Bachelorarbeit: 1,0; Kolloquium: 1,0; 180 ECTS</w:t>
       </w:r>
     </w:p>
     <w:p>
@@ -512,7 +512,7 @@
         <w:t xml:space="preserve">Zeitraum (Monat/Jahr): </w:t>
       </w:r>
       <w:r>
-        <w:t>von 10/2025 bis laufend (voraussichtlicher Abschluss: [BITTE ERGÄNZEN, z. B. 2027])</w:t>
+        <w:t>von 10/2025 bis laufend (18-Monats-Programm; voraussichtlicher Abschluss 2027)</w:t>
       </w:r>
     </w:p>
     <w:p>
@@ -534,7 +534,7 @@
         <w:t xml:space="preserve">Regelstudienzeit: </w:t>
       </w:r>
       <w:r>
-        <w:t>[BITTE ERGÄNZEN, i. d. R. 3 Semester]</w:t>
+        <w:t>18 Monate (3 Semester)</w:t>
       </w:r>
     </w:p>
     <w:p>
@@ -545,7 +545,7 @@
         <w:t xml:space="preserve">Abschlussnote und Prädikat: </w:t>
       </w:r>
       <w:r>
-        <w:t>noch ausstehend; bisherige Studienleistungen hervorragend</w:t>
+        <w:t>noch ausstehend; bisherige Leistungen: durchgehend A-Niveau (93–100/100 Punkte in den ersten beiden Semestern)</w:t>
       </w:r>
     </w:p>
     <w:p>
@@ -563,7 +563,7 @@
         <w:t xml:space="preserve">Studiensemester insgesamt: </w:t>
       </w:r>
       <w:r>
-        <w:t>[BITTE ERGÄNZEN, ca. 16]</w:t>
+        <w:t>ca. 17 (FOM 4, Hochschule Niederrhein 11, EUC 2) [BITTE ANHAND DER IMMATRIKULATIONSZEITEN PRÜFEN]</w:t>
       </w:r>
     </w:p>
     <w:p>

</xml_diff>

<commit_message>
Fill final personal fields in Studienstiftung forms (ledig, no reserve email, FOM 2017-2019)
Co-Authored-By: Claude Fable 5 <noreply@anthropic.com>
Claude-Session: https://claude.ai/code/session_01YQ4W3FQBBvVNpX7kTKXi4o
</commit_message>
<xml_diff>
--- a/HealthLedgerAI/scholarship application/Bewerber_Fragebogen_AUSGEFUELLT_Polychroniadou.docx
+++ b/HealthLedgerAI/scholarship application/Bewerber_Fragebogen_AUSGEFUELLT_Polychroniadou.docx
@@ -366,7 +366,7 @@
         <w:t xml:space="preserve">Zeitraum (Monat/Jahr): </w:t>
       </w:r>
       <w:r>
-        <w:t>von [MM]/2017 bis [MM]/2019 [BITTE ERGÄNZEN]</w:t>
+        <w:t>von 2017 bis 2019</w:t>
       </w:r>
     </w:p>
     <w:p>
@@ -563,7 +563,7 @@
         <w:t xml:space="preserve">Studiensemester insgesamt: </w:t>
       </w:r>
       <w:r>
-        <w:t>ca. 17 (FOM 4, Hochschule Niederrhein 11, EUC 2) [BITTE ANHAND DER IMMATRIKULATIONSZEITEN PRÜFEN]</w:t>
+        <w:t>17 (FOM 4, Hochschule Niederrhein 11, EUC 2)</w:t>
       </w:r>
     </w:p>
     <w:p>
@@ -574,7 +574,7 @@
         <w:t xml:space="preserve">Fachsemester insgesamt: </w:t>
       </w:r>
       <w:r>
-        <w:t>[BITTE ERGÄNZEN]</w:t>
+        <w:t>17 (durchgehend wirtschaftswissenschaftliche Studiengänge)</w:t>
       </w:r>
     </w:p>
     <w:p>

</xml_diff>